<commit_message>
Remove all fill shading from Project Experience table
Drops every cell fill so the table renders as black text and black rules
on white. Title and header rows keep bold weight instead of reversed-out
white-on-color text, and owner email links keep their mailto targets but
render plain black with no underline.

Co-Authored-By: Claude Opus 5 <noreply@anthropic.com>
Claude-Session: https://claude.ai/code/session_01Y4HvCpxrc6ANCAK1BHtzLe
</commit_message>
<xml_diff>
--- a/output/B_1.2_Past_Experience.docx
+++ b/output/B_1.2_Past_Experience.docx
@@ -81,12 +81,12 @@
       <w:tblPr>
         <w:tblW w:w="9360" w:type="dxa"/>
         <w:tblBorders>
-          <w:top w:val="single" w:sz="4" w:space="0" w:color="8EA9DB"/>
-          <w:left w:val="single" w:sz="4" w:space="0" w:color="8EA9DB"/>
-          <w:bottom w:val="single" w:sz="4" w:space="0" w:color="8EA9DB"/>
-          <w:right w:val="single" w:sz="4" w:space="0" w:color="8EA9DB"/>
-          <w:insideH w:val="single" w:sz="4" w:space="0" w:color="8EA9DB"/>
-          <w:insideV w:val="single" w:sz="4" w:space="0" w:color="8EA9DB"/>
+          <w:top w:val="single" w:sz="4" w:space="0" w:color="000000"/>
+          <w:left w:val="single" w:sz="4" w:space="0" w:color="000000"/>
+          <w:bottom w:val="single" w:sz="4" w:space="0" w:color="000000"/>
+          <w:right w:val="single" w:sz="4" w:space="0" w:color="000000"/>
+          <w:insideH w:val="single" w:sz="4" w:space="0" w:color="000000"/>
+          <w:insideV w:val="single" w:sz="4" w:space="0" w:color="000000"/>
         </w:tblBorders>
         <w:tblLayout w:type="fixed"/>
         <w:tblCellMar>
@@ -113,7 +113,6 @@
           <w:tcPr>
             <w:tcW w:w="9360" w:type="dxa"/>
             <w:gridSpan w:val="5"/>
-            <w:shd w:val="clear" w:color="auto" w:fill="1F3864"/>
             <w:vAlign w:val="center"/>
           </w:tcPr>
           <w:p>
@@ -128,7 +127,7 @@
               <w:rPr>
                 <w:b/>
                 <w:bCs/>
-                <w:color w:val="FFFFFF"/>
+                <w:color w:val="000000"/>
                 <w:sz w:val="22"/>
                 <w:szCs w:val="22"/>
               </w:rPr>
@@ -145,7 +144,6 @@
         <w:tc>
           <w:tcPr>
             <w:tcW w:w="2000" w:type="dxa"/>
-            <w:shd w:val="clear" w:color="auto" w:fill="1F3864"/>
             <w:vAlign w:val="center"/>
           </w:tcPr>
           <w:p>
@@ -160,7 +158,7 @@
               <w:rPr>
                 <w:b/>
                 <w:bCs/>
-                <w:color w:val="FFFFFF"/>
+                <w:color w:val="000000"/>
                 <w:sz w:val="17"/>
                 <w:szCs w:val="17"/>
               </w:rPr>
@@ -171,7 +169,6 @@
         <w:tc>
           <w:tcPr>
             <w:tcW w:w="1840" w:type="dxa"/>
-            <w:shd w:val="clear" w:color="auto" w:fill="1F3864"/>
             <w:vAlign w:val="center"/>
           </w:tcPr>
           <w:p>
@@ -186,7 +183,7 @@
               <w:rPr>
                 <w:b/>
                 <w:bCs/>
-                <w:color w:val="FFFFFF"/>
+                <w:color w:val="000000"/>
                 <w:sz w:val="17"/>
                 <w:szCs w:val="17"/>
               </w:rPr>
@@ -197,7 +194,6 @@
         <w:tc>
           <w:tcPr>
             <w:tcW w:w="1840" w:type="dxa"/>
-            <w:shd w:val="clear" w:color="auto" w:fill="1F3864"/>
             <w:vAlign w:val="center"/>
           </w:tcPr>
           <w:p>
@@ -212,7 +208,7 @@
               <w:rPr>
                 <w:b/>
                 <w:bCs/>
-                <w:color w:val="FFFFFF"/>
+                <w:color w:val="000000"/>
                 <w:sz w:val="17"/>
                 <w:szCs w:val="17"/>
               </w:rPr>
@@ -223,7 +219,6 @@
         <w:tc>
           <w:tcPr>
             <w:tcW w:w="1840" w:type="dxa"/>
-            <w:shd w:val="clear" w:color="auto" w:fill="1F3864"/>
             <w:vAlign w:val="center"/>
           </w:tcPr>
           <w:p>
@@ -238,7 +233,7 @@
               <w:rPr>
                 <w:b/>
                 <w:bCs/>
-                <w:color w:val="FFFFFF"/>
+                <w:color w:val="000000"/>
                 <w:sz w:val="17"/>
                 <w:szCs w:val="17"/>
               </w:rPr>
@@ -249,7 +244,6 @@
         <w:tc>
           <w:tcPr>
             <w:tcW w:w="1840" w:type="dxa"/>
-            <w:shd w:val="clear" w:color="auto" w:fill="1F3864"/>
             <w:vAlign w:val="center"/>
           </w:tcPr>
           <w:p>
@@ -264,7 +258,7 @@
               <w:rPr>
                 <w:b/>
                 <w:bCs/>
-                <w:color w:val="FFFFFF"/>
+                <w:color w:val="000000"/>
                 <w:sz w:val="17"/>
                 <w:szCs w:val="17"/>
               </w:rPr>
@@ -280,7 +274,6 @@
         <w:tc>
           <w:tcPr>
             <w:tcW w:w="2000" w:type="dxa"/>
-            <w:shd w:val="clear" w:color="auto" w:fill="BDD7EE"/>
             <w:vAlign w:val="center"/>
           </w:tcPr>
           <w:p>
@@ -304,7 +297,6 @@
         <w:tc>
           <w:tcPr>
             <w:tcW w:w="1840" w:type="dxa"/>
-            <w:shd w:val="clear" w:color="auto" w:fill="DEEAF6"/>
             <w:vAlign w:val="center"/>
           </w:tcPr>
           <w:p>
@@ -326,7 +318,6 @@
         <w:tc>
           <w:tcPr>
             <w:tcW w:w="1840" w:type="dxa"/>
-            <w:shd w:val="clear" w:color="auto" w:fill="DEEAF6"/>
             <w:vAlign w:val="center"/>
           </w:tcPr>
           <w:p>
@@ -348,7 +339,6 @@
         <w:tc>
           <w:tcPr>
             <w:tcW w:w="1840" w:type="dxa"/>
-            <w:shd w:val="clear" w:color="auto" w:fill="DEEAF6"/>
             <w:vAlign w:val="center"/>
           </w:tcPr>
           <w:p>
@@ -370,7 +360,6 @@
         <w:tc>
           <w:tcPr>
             <w:tcW w:w="1840" w:type="dxa"/>
-            <w:shd w:val="clear" w:color="auto" w:fill="DEEAF6"/>
             <w:vAlign w:val="center"/>
           </w:tcPr>
           <w:p>
@@ -397,7 +386,6 @@
         <w:tc>
           <w:tcPr>
             <w:tcW w:w="2000" w:type="dxa"/>
-            <w:shd w:val="clear" w:color="auto" w:fill="BDD7EE"/>
             <w:vAlign w:val="center"/>
           </w:tcPr>
           <w:p>
@@ -421,7 +409,6 @@
         <w:tc>
           <w:tcPr>
             <w:tcW w:w="1840" w:type="dxa"/>
-            <w:shd w:val="clear" w:color="auto" w:fill="F2F2F2"/>
             <w:vAlign w:val="center"/>
           </w:tcPr>
           <w:p>
@@ -444,7 +431,6 @@
         <w:tc>
           <w:tcPr>
             <w:tcW w:w="1840" w:type="dxa"/>
-            <w:shd w:val="clear" w:color="auto" w:fill="F2F2F2"/>
             <w:vAlign w:val="center"/>
           </w:tcPr>
           <w:p>
@@ -467,7 +453,6 @@
         <w:tc>
           <w:tcPr>
             <w:tcW w:w="1840" w:type="dxa"/>
-            <w:shd w:val="clear" w:color="auto" w:fill="F2F2F2"/>
             <w:vAlign w:val="center"/>
           </w:tcPr>
           <w:p>
@@ -490,7 +475,6 @@
         <w:tc>
           <w:tcPr>
             <w:tcW w:w="1840" w:type="dxa"/>
-            <w:shd w:val="clear" w:color="auto" w:fill="F2F2F2"/>
             <w:vAlign w:val="center"/>
           </w:tcPr>
           <w:p>
@@ -517,7 +501,6 @@
         <w:tc>
           <w:tcPr>
             <w:tcW w:w="2000" w:type="dxa"/>
-            <w:shd w:val="clear" w:color="auto" w:fill="BDD7EE"/>
             <w:vAlign w:val="center"/>
           </w:tcPr>
           <w:p>
@@ -541,7 +524,6 @@
         <w:tc>
           <w:tcPr>
             <w:tcW w:w="1840" w:type="dxa"/>
-            <w:shd w:val="clear" w:color="auto" w:fill="DEEAF6"/>
             <w:vAlign w:val="center"/>
           </w:tcPr>
           <w:p>
@@ -563,7 +545,6 @@
         <w:tc>
           <w:tcPr>
             <w:tcW w:w="1840" w:type="dxa"/>
-            <w:shd w:val="clear" w:color="auto" w:fill="DEEAF6"/>
             <w:vAlign w:val="center"/>
           </w:tcPr>
           <w:p>
@@ -585,7 +566,6 @@
         <w:tc>
           <w:tcPr>
             <w:tcW w:w="1840" w:type="dxa"/>
-            <w:shd w:val="clear" w:color="auto" w:fill="DEEAF6"/>
             <w:vAlign w:val="center"/>
           </w:tcPr>
           <w:p>
@@ -607,7 +587,6 @@
         <w:tc>
           <w:tcPr>
             <w:tcW w:w="1840" w:type="dxa"/>
-            <w:shd w:val="clear" w:color="auto" w:fill="DEEAF6"/>
             <w:vAlign w:val="center"/>
           </w:tcPr>
           <w:p>
@@ -634,7 +613,6 @@
         <w:tc>
           <w:tcPr>
             <w:tcW w:w="2000" w:type="dxa"/>
-            <w:shd w:val="clear" w:color="auto" w:fill="BDD7EE"/>
             <w:vAlign w:val="center"/>
           </w:tcPr>
           <w:p>
@@ -658,7 +636,6 @@
         <w:tc>
           <w:tcPr>
             <w:tcW w:w="1840" w:type="dxa"/>
-            <w:shd w:val="clear" w:color="auto" w:fill="F2F2F2"/>
             <w:vAlign w:val="center"/>
           </w:tcPr>
           <w:p>
@@ -680,7 +657,6 @@
         <w:tc>
           <w:tcPr>
             <w:tcW w:w="1840" w:type="dxa"/>
-            <w:shd w:val="clear" w:color="auto" w:fill="F2F2F2"/>
             <w:vAlign w:val="center"/>
           </w:tcPr>
           <w:p>
@@ -702,7 +678,6 @@
         <w:tc>
           <w:tcPr>
             <w:tcW w:w="1840" w:type="dxa"/>
-            <w:shd w:val="clear" w:color="auto" w:fill="F2F2F2"/>
             <w:vAlign w:val="center"/>
           </w:tcPr>
           <w:p>
@@ -724,7 +699,6 @@
         <w:tc>
           <w:tcPr>
             <w:tcW w:w="1840" w:type="dxa"/>
-            <w:shd w:val="clear" w:color="auto" w:fill="F2F2F2"/>
             <w:vAlign w:val="center"/>
           </w:tcPr>
           <w:p>
@@ -751,7 +725,6 @@
         <w:tc>
           <w:tcPr>
             <w:tcW w:w="2000" w:type="dxa"/>
-            <w:shd w:val="clear" w:color="auto" w:fill="BDD7EE"/>
             <w:vAlign w:val="center"/>
           </w:tcPr>
           <w:p>
@@ -775,7 +748,6 @@
         <w:tc>
           <w:tcPr>
             <w:tcW w:w="1840" w:type="dxa"/>
-            <w:shd w:val="clear" w:color="auto" w:fill="DEEAF6"/>
             <w:vAlign w:val="center"/>
           </w:tcPr>
           <w:p>
@@ -797,7 +769,6 @@
         <w:tc>
           <w:tcPr>
             <w:tcW w:w="1840" w:type="dxa"/>
-            <w:shd w:val="clear" w:color="auto" w:fill="DEEAF6"/>
             <w:vAlign w:val="center"/>
           </w:tcPr>
           <w:p>
@@ -819,7 +790,6 @@
         <w:tc>
           <w:tcPr>
             <w:tcW w:w="1840" w:type="dxa"/>
-            <w:shd w:val="clear" w:color="auto" w:fill="DEEAF6"/>
             <w:vAlign w:val="center"/>
           </w:tcPr>
           <w:p>
@@ -841,7 +811,6 @@
         <w:tc>
           <w:tcPr>
             <w:tcW w:w="1840" w:type="dxa"/>
-            <w:shd w:val="clear" w:color="auto" w:fill="DEEAF6"/>
             <w:vAlign w:val="center"/>
           </w:tcPr>
           <w:p>
@@ -868,7 +837,6 @@
         <w:tc>
           <w:tcPr>
             <w:tcW w:w="2000" w:type="dxa"/>
-            <w:shd w:val="clear" w:color="auto" w:fill="BDD7EE"/>
             <w:vAlign w:val="center"/>
           </w:tcPr>
           <w:p>
@@ -892,7 +860,6 @@
         <w:tc>
           <w:tcPr>
             <w:tcW w:w="1840" w:type="dxa"/>
-            <w:shd w:val="clear" w:color="auto" w:fill="F2F2F2"/>
             <w:vAlign w:val="center"/>
           </w:tcPr>
           <w:p>
@@ -914,7 +881,6 @@
         <w:tc>
           <w:tcPr>
             <w:tcW w:w="1840" w:type="dxa"/>
-            <w:shd w:val="clear" w:color="auto" w:fill="F2F2F2"/>
             <w:vAlign w:val="center"/>
           </w:tcPr>
           <w:p>
@@ -936,7 +902,6 @@
         <w:tc>
           <w:tcPr>
             <w:tcW w:w="1840" w:type="dxa"/>
-            <w:shd w:val="clear" w:color="auto" w:fill="F2F2F2"/>
             <w:vAlign w:val="center"/>
           </w:tcPr>
           <w:p>
@@ -958,7 +923,6 @@
         <w:tc>
           <w:tcPr>
             <w:tcW w:w="1840" w:type="dxa"/>
-            <w:shd w:val="clear" w:color="auto" w:fill="F2F2F2"/>
             <w:vAlign w:val="center"/>
           </w:tcPr>
           <w:p>
@@ -985,7 +949,6 @@
         <w:tc>
           <w:tcPr>
             <w:tcW w:w="2000" w:type="dxa"/>
-            <w:shd w:val="clear" w:color="auto" w:fill="BDD7EE"/>
             <w:vAlign w:val="center"/>
           </w:tcPr>
           <w:p>
@@ -1009,7 +972,6 @@
         <w:tc>
           <w:tcPr>
             <w:tcW w:w="1840" w:type="dxa"/>
-            <w:shd w:val="clear" w:color="auto" w:fill="DEEAF6"/>
             <w:vAlign w:val="center"/>
           </w:tcPr>
           <w:p>
@@ -1031,7 +993,6 @@
         <w:tc>
           <w:tcPr>
             <w:tcW w:w="1840" w:type="dxa"/>
-            <w:shd w:val="clear" w:color="auto" w:fill="DEEAF6"/>
             <w:vAlign w:val="center"/>
           </w:tcPr>
           <w:p>
@@ -1053,7 +1014,6 @@
         <w:tc>
           <w:tcPr>
             <w:tcW w:w="1840" w:type="dxa"/>
-            <w:shd w:val="clear" w:color="auto" w:fill="DEEAF6"/>
             <w:vAlign w:val="center"/>
           </w:tcPr>
           <w:p>
@@ -1075,7 +1035,6 @@
         <w:tc>
           <w:tcPr>
             <w:tcW w:w="1840" w:type="dxa"/>
-            <w:shd w:val="clear" w:color="auto" w:fill="DEEAF6"/>
             <w:vAlign w:val="center"/>
           </w:tcPr>
           <w:p>
@@ -1102,7 +1061,6 @@
         <w:tc>
           <w:tcPr>
             <w:tcW w:w="2000" w:type="dxa"/>
-            <w:shd w:val="clear" w:color="auto" w:fill="BDD7EE"/>
             <w:vAlign w:val="center"/>
           </w:tcPr>
           <w:p>
@@ -1126,7 +1084,6 @@
         <w:tc>
           <w:tcPr>
             <w:tcW w:w="1840" w:type="dxa"/>
-            <w:shd w:val="clear" w:color="auto" w:fill="F2F2F2"/>
             <w:vAlign w:val="center"/>
           </w:tcPr>
           <w:p>
@@ -1148,7 +1105,6 @@
         <w:tc>
           <w:tcPr>
             <w:tcW w:w="1840" w:type="dxa"/>
-            <w:shd w:val="clear" w:color="auto" w:fill="F2F2F2"/>
             <w:vAlign w:val="center"/>
           </w:tcPr>
           <w:p>
@@ -1170,7 +1126,6 @@
         <w:tc>
           <w:tcPr>
             <w:tcW w:w="1840" w:type="dxa"/>
-            <w:shd w:val="clear" w:color="auto" w:fill="F2F2F2"/>
             <w:vAlign w:val="center"/>
           </w:tcPr>
           <w:p>
@@ -1192,7 +1147,6 @@
         <w:tc>
           <w:tcPr>
             <w:tcW w:w="1840" w:type="dxa"/>
-            <w:shd w:val="clear" w:color="auto" w:fill="F2F2F2"/>
             <w:vAlign w:val="center"/>
           </w:tcPr>
           <w:p>
@@ -1219,7 +1173,6 @@
         <w:tc>
           <w:tcPr>
             <w:tcW w:w="2000" w:type="dxa"/>
-            <w:shd w:val="clear" w:color="auto" w:fill="BDD7EE"/>
             <w:vAlign w:val="center"/>
           </w:tcPr>
           <w:p>
@@ -1243,7 +1196,6 @@
         <w:tc>
           <w:tcPr>
             <w:tcW w:w="1840" w:type="dxa"/>
-            <w:shd w:val="clear" w:color="auto" w:fill="DEEAF6"/>
             <w:vAlign w:val="center"/>
           </w:tcPr>
           <w:p>
@@ -1256,7 +1208,8 @@
             <w:hyperlink r:id="rId100">
               <w:r>
                 <w:rPr>
-                  <w:rStyle w:val="Hyperlink"/>
+                  <w:color w:val="000000"/>
+                  <w:u w:val="none"/>
                   <w:sz w:val="16"/>
                   <w:szCs w:val="16"/>
                 </w:rPr>
@@ -1268,7 +1221,6 @@
         <w:tc>
           <w:tcPr>
             <w:tcW w:w="1840" w:type="dxa"/>
-            <w:shd w:val="clear" w:color="auto" w:fill="DEEAF6"/>
             <w:vAlign w:val="center"/>
           </w:tcPr>
           <w:p>
@@ -1281,7 +1233,8 @@
             <w:hyperlink r:id="rId101">
               <w:r>
                 <w:rPr>
-                  <w:rStyle w:val="Hyperlink"/>
+                  <w:color w:val="000000"/>
+                  <w:u w:val="none"/>
                   <w:sz w:val="16"/>
                   <w:szCs w:val="16"/>
                 </w:rPr>
@@ -1293,7 +1246,6 @@
         <w:tc>
           <w:tcPr>
             <w:tcW w:w="1840" w:type="dxa"/>
-            <w:shd w:val="clear" w:color="auto" w:fill="DEEAF6"/>
             <w:vAlign w:val="center"/>
           </w:tcPr>
           <w:p>
@@ -1306,7 +1258,8 @@
             <w:hyperlink r:id="rId101">
               <w:r>
                 <w:rPr>
-                  <w:rStyle w:val="Hyperlink"/>
+                  <w:color w:val="000000"/>
+                  <w:u w:val="none"/>
                   <w:sz w:val="16"/>
                   <w:szCs w:val="16"/>
                 </w:rPr>
@@ -1318,7 +1271,6 @@
         <w:tc>
           <w:tcPr>
             <w:tcW w:w="1840" w:type="dxa"/>
-            <w:shd w:val="clear" w:color="auto" w:fill="DEEAF6"/>
             <w:vAlign w:val="center"/>
           </w:tcPr>
           <w:p>
@@ -1345,7 +1297,6 @@
         <w:tc>
           <w:tcPr>
             <w:tcW w:w="2000" w:type="dxa"/>
-            <w:shd w:val="clear" w:color="auto" w:fill="BDD7EE"/>
             <w:vAlign w:val="center"/>
           </w:tcPr>
           <w:p>
@@ -1369,7 +1320,6 @@
         <w:tc>
           <w:tcPr>
             <w:tcW w:w="1840" w:type="dxa"/>
-            <w:shd w:val="clear" w:color="auto" w:fill="F2F2F2"/>
             <w:vAlign w:val="center"/>
           </w:tcPr>
           <w:p>
@@ -1392,7 +1342,6 @@
         <w:tc>
           <w:tcPr>
             <w:tcW w:w="1840" w:type="dxa"/>
-            <w:shd w:val="clear" w:color="auto" w:fill="F2F2F2"/>
             <w:vAlign w:val="center"/>
           </w:tcPr>
           <w:p>
@@ -1415,7 +1364,6 @@
         <w:tc>
           <w:tcPr>
             <w:tcW w:w="1840" w:type="dxa"/>
-            <w:shd w:val="clear" w:color="auto" w:fill="F2F2F2"/>
             <w:vAlign w:val="center"/>
           </w:tcPr>
           <w:p>
@@ -1437,7 +1385,6 @@
         <w:tc>
           <w:tcPr>
             <w:tcW w:w="1840" w:type="dxa"/>
-            <w:shd w:val="clear" w:color="auto" w:fill="F2F2F2"/>
             <w:vAlign w:val="center"/>
           </w:tcPr>
           <w:p>
@@ -1464,7 +1411,6 @@
         <w:tc>
           <w:tcPr>
             <w:tcW w:w="2000" w:type="dxa"/>
-            <w:shd w:val="clear" w:color="auto" w:fill="BDD7EE"/>
             <w:vAlign w:val="center"/>
           </w:tcPr>
           <w:p>
@@ -1488,7 +1434,6 @@
         <w:tc>
           <w:tcPr>
             <w:tcW w:w="1840" w:type="dxa"/>
-            <w:shd w:val="clear" w:color="auto" w:fill="DEEAF6"/>
             <w:vAlign w:val="center"/>
           </w:tcPr>
           <w:p>
@@ -1511,7 +1456,6 @@
         <w:tc>
           <w:tcPr>
             <w:tcW w:w="1840" w:type="dxa"/>
-            <w:shd w:val="clear" w:color="auto" w:fill="DEEAF6"/>
             <w:vAlign w:val="center"/>
           </w:tcPr>
           <w:p>
@@ -1534,7 +1478,6 @@
         <w:tc>
           <w:tcPr>
             <w:tcW w:w="1840" w:type="dxa"/>
-            <w:shd w:val="clear" w:color="auto" w:fill="DEEAF6"/>
             <w:vAlign w:val="center"/>
           </w:tcPr>
           <w:p>
@@ -1557,7 +1500,6 @@
         <w:tc>
           <w:tcPr>
             <w:tcW w:w="1840" w:type="dxa"/>
-            <w:shd w:val="clear" w:color="auto" w:fill="DEEAF6"/>
             <w:vAlign w:val="center"/>
           </w:tcPr>
           <w:p>
@@ -1584,7 +1526,6 @@
         <w:tc>
           <w:tcPr>
             <w:tcW w:w="2000" w:type="dxa"/>
-            <w:shd w:val="clear" w:color="auto" w:fill="BDD7EE"/>
             <w:vAlign w:val="center"/>
           </w:tcPr>
           <w:p>
@@ -1608,7 +1549,6 @@
         <w:tc>
           <w:tcPr>
             <w:tcW w:w="1840" w:type="dxa"/>
-            <w:shd w:val="clear" w:color="auto" w:fill="F2F2F2"/>
             <w:vAlign w:val="center"/>
           </w:tcPr>
           <w:p>
@@ -1631,7 +1571,6 @@
         <w:tc>
           <w:tcPr>
             <w:tcW w:w="1840" w:type="dxa"/>
-            <w:shd w:val="clear" w:color="auto" w:fill="F2F2F2"/>
             <w:vAlign w:val="center"/>
           </w:tcPr>
           <w:p>
@@ -1654,7 +1593,6 @@
         <w:tc>
           <w:tcPr>
             <w:tcW w:w="1840" w:type="dxa"/>
-            <w:shd w:val="clear" w:color="auto" w:fill="F2F2F2"/>
             <w:vAlign w:val="center"/>
           </w:tcPr>
           <w:p>
@@ -1677,7 +1615,6 @@
         <w:tc>
           <w:tcPr>
             <w:tcW w:w="1840" w:type="dxa"/>
-            <w:shd w:val="clear" w:color="auto" w:fill="F2F2F2"/>
             <w:vAlign w:val="center"/>
           </w:tcPr>
           <w:p>
@@ -1705,7 +1642,6 @@
         <w:tc>
           <w:tcPr>
             <w:tcW w:w="2000" w:type="dxa"/>
-            <w:shd w:val="clear" w:color="auto" w:fill="BDD7EE"/>
             <w:vAlign w:val="center"/>
           </w:tcPr>
           <w:p>
@@ -1729,7 +1665,6 @@
         <w:tc>
           <w:tcPr>
             <w:tcW w:w="1840" w:type="dxa"/>
-            <w:shd w:val="clear" w:color="auto" w:fill="DEEAF6"/>
             <w:vAlign w:val="center"/>
           </w:tcPr>
           <w:p>
@@ -1751,7 +1686,6 @@
         <w:tc>
           <w:tcPr>
             <w:tcW w:w="1840" w:type="dxa"/>
-            <w:shd w:val="clear" w:color="auto" w:fill="DEEAF6"/>
             <w:vAlign w:val="center"/>
           </w:tcPr>
           <w:p>
@@ -1773,7 +1707,6 @@
         <w:tc>
           <w:tcPr>
             <w:tcW w:w="1840" w:type="dxa"/>
-            <w:shd w:val="clear" w:color="auto" w:fill="DEEAF6"/>
             <w:vAlign w:val="center"/>
           </w:tcPr>
           <w:p>
@@ -1795,7 +1728,6 @@
         <w:tc>
           <w:tcPr>
             <w:tcW w:w="1840" w:type="dxa"/>
-            <w:shd w:val="clear" w:color="auto" w:fill="DEEAF6"/>
             <w:vAlign w:val="center"/>
           </w:tcPr>
           <w:p>
@@ -1822,7 +1754,6 @@
         <w:tc>
           <w:tcPr>
             <w:tcW w:w="2000" w:type="dxa"/>
-            <w:shd w:val="clear" w:color="auto" w:fill="BDD7EE"/>
             <w:vAlign w:val="center"/>
           </w:tcPr>
           <w:p>
@@ -1846,7 +1777,6 @@
         <w:tc>
           <w:tcPr>
             <w:tcW w:w="1840" w:type="dxa"/>
-            <w:shd w:val="clear" w:color="auto" w:fill="F2F2F2"/>
             <w:vAlign w:val="center"/>
           </w:tcPr>
           <w:p>
@@ -1868,7 +1798,6 @@
         <w:tc>
           <w:tcPr>
             <w:tcW w:w="1840" w:type="dxa"/>
-            <w:shd w:val="clear" w:color="auto" w:fill="F2F2F2"/>
             <w:vAlign w:val="center"/>
           </w:tcPr>
           <w:p>
@@ -1890,7 +1819,6 @@
         <w:tc>
           <w:tcPr>
             <w:tcW w:w="1840" w:type="dxa"/>
-            <w:shd w:val="clear" w:color="auto" w:fill="F2F2F2"/>
             <w:vAlign w:val="center"/>
           </w:tcPr>
           <w:p>
@@ -1912,7 +1840,6 @@
         <w:tc>
           <w:tcPr>
             <w:tcW w:w="1840" w:type="dxa"/>
-            <w:shd w:val="clear" w:color="auto" w:fill="F2F2F2"/>
             <w:vAlign w:val="center"/>
           </w:tcPr>
           <w:p>
@@ -1939,7 +1866,6 @@
         <w:tc>
           <w:tcPr>
             <w:tcW w:w="2000" w:type="dxa"/>
-            <w:shd w:val="clear" w:color="auto" w:fill="BDD7EE"/>
             <w:vAlign w:val="center"/>
           </w:tcPr>
           <w:p>
@@ -1963,7 +1889,6 @@
         <w:tc>
           <w:tcPr>
             <w:tcW w:w="1840" w:type="dxa"/>
-            <w:shd w:val="clear" w:color="auto" w:fill="DEEAF6"/>
             <w:vAlign w:val="center"/>
           </w:tcPr>
           <w:p>
@@ -1985,7 +1910,6 @@
         <w:tc>
           <w:tcPr>
             <w:tcW w:w="1840" w:type="dxa"/>
-            <w:shd w:val="clear" w:color="auto" w:fill="DEEAF6"/>
             <w:vAlign w:val="center"/>
           </w:tcPr>
           <w:p>
@@ -2007,7 +1931,6 @@
         <w:tc>
           <w:tcPr>
             <w:tcW w:w="1840" w:type="dxa"/>
-            <w:shd w:val="clear" w:color="auto" w:fill="DEEAF6"/>
             <w:vAlign w:val="center"/>
           </w:tcPr>
           <w:p>
@@ -2029,7 +1952,6 @@
         <w:tc>
           <w:tcPr>
             <w:tcW w:w="1840" w:type="dxa"/>
-            <w:shd w:val="clear" w:color="auto" w:fill="DEEAF6"/>
             <w:vAlign w:val="center"/>
           </w:tcPr>
           <w:p>
@@ -2056,7 +1978,6 @@
         <w:tc>
           <w:tcPr>
             <w:tcW w:w="2000" w:type="dxa"/>
-            <w:shd w:val="clear" w:color="auto" w:fill="BDD7EE"/>
             <w:vAlign w:val="center"/>
           </w:tcPr>
           <w:p>
@@ -2080,7 +2001,6 @@
         <w:tc>
           <w:tcPr>
             <w:tcW w:w="1840" w:type="dxa"/>
-            <w:shd w:val="clear" w:color="auto" w:fill="F2F2F2"/>
             <w:vAlign w:val="center"/>
           </w:tcPr>
           <w:p>
@@ -2102,7 +2022,6 @@
         <w:tc>
           <w:tcPr>
             <w:tcW w:w="1840" w:type="dxa"/>
-            <w:shd w:val="clear" w:color="auto" w:fill="F2F2F2"/>
             <w:vAlign w:val="center"/>
           </w:tcPr>
           <w:p>
@@ -2124,7 +2043,6 @@
         <w:tc>
           <w:tcPr>
             <w:tcW w:w="1840" w:type="dxa"/>
-            <w:shd w:val="clear" w:color="auto" w:fill="F2F2F2"/>
             <w:vAlign w:val="center"/>
           </w:tcPr>
           <w:p>
@@ -2146,7 +2064,6 @@
         <w:tc>
           <w:tcPr>
             <w:tcW w:w="1840" w:type="dxa"/>
-            <w:shd w:val="clear" w:color="auto" w:fill="F2F2F2"/>
             <w:vAlign w:val="center"/>
           </w:tcPr>
           <w:p>
@@ -2173,7 +2090,6 @@
         <w:tc>
           <w:tcPr>
             <w:tcW w:w="2000" w:type="dxa"/>
-            <w:shd w:val="clear" w:color="auto" w:fill="BDD7EE"/>
             <w:vAlign w:val="center"/>
           </w:tcPr>
           <w:p>
@@ -2197,7 +2113,6 @@
         <w:tc>
           <w:tcPr>
             <w:tcW w:w="1840" w:type="dxa"/>
-            <w:shd w:val="clear" w:color="auto" w:fill="DEEAF6"/>
             <w:vAlign w:val="center"/>
           </w:tcPr>
           <w:p>
@@ -2219,7 +2134,6 @@
         <w:tc>
           <w:tcPr>
             <w:tcW w:w="1840" w:type="dxa"/>
-            <w:shd w:val="clear" w:color="auto" w:fill="DEEAF6"/>
             <w:vAlign w:val="center"/>
           </w:tcPr>
           <w:p>
@@ -2241,7 +2155,6 @@
         <w:tc>
           <w:tcPr>
             <w:tcW w:w="1840" w:type="dxa"/>
-            <w:shd w:val="clear" w:color="auto" w:fill="DEEAF6"/>
             <w:vAlign w:val="center"/>
           </w:tcPr>
           <w:p>
@@ -2263,7 +2176,6 @@
         <w:tc>
           <w:tcPr>
             <w:tcW w:w="1840" w:type="dxa"/>
-            <w:shd w:val="clear" w:color="auto" w:fill="DEEAF6"/>
             <w:vAlign w:val="center"/>
           </w:tcPr>
           <w:p>
@@ -2290,7 +2202,6 @@
         <w:tc>
           <w:tcPr>
             <w:tcW w:w="2000" w:type="dxa"/>
-            <w:shd w:val="clear" w:color="auto" w:fill="BDD7EE"/>
             <w:vAlign w:val="center"/>
           </w:tcPr>
           <w:p>
@@ -2314,7 +2225,6 @@
         <w:tc>
           <w:tcPr>
             <w:tcW w:w="1840" w:type="dxa"/>
-            <w:shd w:val="clear" w:color="auto" w:fill="F2F2F2"/>
             <w:vAlign w:val="center"/>
           </w:tcPr>
           <w:p>
@@ -2336,7 +2246,6 @@
         <w:tc>
           <w:tcPr>
             <w:tcW w:w="1840" w:type="dxa"/>
-            <w:shd w:val="clear" w:color="auto" w:fill="F2F2F2"/>
             <w:vAlign w:val="center"/>
           </w:tcPr>
           <w:p>
@@ -2358,7 +2267,6 @@
         <w:tc>
           <w:tcPr>
             <w:tcW w:w="1840" w:type="dxa"/>
-            <w:shd w:val="clear" w:color="auto" w:fill="F2F2F2"/>
             <w:vAlign w:val="center"/>
           </w:tcPr>
           <w:p>
@@ -2380,7 +2288,6 @@
         <w:tc>
           <w:tcPr>
             <w:tcW w:w="1840" w:type="dxa"/>
-            <w:shd w:val="clear" w:color="auto" w:fill="F2F2F2"/>
             <w:vAlign w:val="center"/>
           </w:tcPr>
           <w:p>
@@ -2407,7 +2314,6 @@
         <w:tc>
           <w:tcPr>
             <w:tcW w:w="2000" w:type="dxa"/>
-            <w:shd w:val="clear" w:color="auto" w:fill="BDD7EE"/>
             <w:vAlign w:val="center"/>
           </w:tcPr>
           <w:p>
@@ -2431,7 +2337,6 @@
         <w:tc>
           <w:tcPr>
             <w:tcW w:w="1840" w:type="dxa"/>
-            <w:shd w:val="clear" w:color="auto" w:fill="DEEAF6"/>
             <w:vAlign w:val="center"/>
           </w:tcPr>
           <w:p>
@@ -2453,7 +2358,6 @@
         <w:tc>
           <w:tcPr>
             <w:tcW w:w="1840" w:type="dxa"/>
-            <w:shd w:val="clear" w:color="auto" w:fill="DEEAF6"/>
             <w:vAlign w:val="center"/>
           </w:tcPr>
           <w:p>
@@ -2475,7 +2379,6 @@
         <w:tc>
           <w:tcPr>
             <w:tcW w:w="1840" w:type="dxa"/>
-            <w:shd w:val="clear" w:color="auto" w:fill="DEEAF6"/>
             <w:vAlign w:val="center"/>
           </w:tcPr>
           <w:p>
@@ -2497,7 +2400,6 @@
         <w:tc>
           <w:tcPr>
             <w:tcW w:w="1840" w:type="dxa"/>
-            <w:shd w:val="clear" w:color="auto" w:fill="DEEAF6"/>
             <w:vAlign w:val="center"/>
           </w:tcPr>
           <w:p>
@@ -2524,7 +2426,6 @@
         <w:tc>
           <w:tcPr>
             <w:tcW w:w="2000" w:type="dxa"/>
-            <w:shd w:val="clear" w:color="auto" w:fill="BDD7EE"/>
             <w:vAlign w:val="center"/>
           </w:tcPr>
           <w:p>
@@ -2548,7 +2449,6 @@
         <w:tc>
           <w:tcPr>
             <w:tcW w:w="1840" w:type="dxa"/>
-            <w:shd w:val="clear" w:color="auto" w:fill="F2F2F2"/>
             <w:vAlign w:val="center"/>
           </w:tcPr>
           <w:p>
@@ -2570,7 +2470,6 @@
         <w:tc>
           <w:tcPr>
             <w:tcW w:w="1840" w:type="dxa"/>
-            <w:shd w:val="clear" w:color="auto" w:fill="F2F2F2"/>
             <w:vAlign w:val="center"/>
           </w:tcPr>
           <w:p>
@@ -2592,7 +2491,6 @@
         <w:tc>
           <w:tcPr>
             <w:tcW w:w="1840" w:type="dxa"/>
-            <w:shd w:val="clear" w:color="auto" w:fill="F2F2F2"/>
             <w:vAlign w:val="center"/>
           </w:tcPr>
           <w:p>
@@ -2614,7 +2512,6 @@
         <w:tc>
           <w:tcPr>
             <w:tcW w:w="1840" w:type="dxa"/>
-            <w:shd w:val="clear" w:color="auto" w:fill="F2F2F2"/>
             <w:vAlign w:val="center"/>
           </w:tcPr>
           <w:p>
@@ -2641,7 +2538,6 @@
         <w:tc>
           <w:tcPr>
             <w:tcW w:w="2000" w:type="dxa"/>
-            <w:shd w:val="clear" w:color="auto" w:fill="BDD7EE"/>
             <w:vAlign w:val="center"/>
           </w:tcPr>
           <w:p>
@@ -2665,7 +2561,6 @@
         <w:tc>
           <w:tcPr>
             <w:tcW w:w="1840" w:type="dxa"/>
-            <w:shd w:val="clear" w:color="auto" w:fill="DEEAF6"/>
             <w:vAlign w:val="center"/>
           </w:tcPr>
           <w:p>
@@ -2687,7 +2582,6 @@
         <w:tc>
           <w:tcPr>
             <w:tcW w:w="1840" w:type="dxa"/>
-            <w:shd w:val="clear" w:color="auto" w:fill="DEEAF6"/>
             <w:vAlign w:val="center"/>
           </w:tcPr>
           <w:p>
@@ -2709,7 +2603,6 @@
         <w:tc>
           <w:tcPr>
             <w:tcW w:w="1840" w:type="dxa"/>
-            <w:shd w:val="clear" w:color="auto" w:fill="DEEAF6"/>
             <w:vAlign w:val="center"/>
           </w:tcPr>
           <w:p>
@@ -2731,7 +2624,6 @@
         <w:tc>
           <w:tcPr>
             <w:tcW w:w="1840" w:type="dxa"/>
-            <w:shd w:val="clear" w:color="auto" w:fill="DEEAF6"/>
             <w:vAlign w:val="center"/>
           </w:tcPr>
           <w:p>
@@ -2758,7 +2650,6 @@
         <w:tc>
           <w:tcPr>
             <w:tcW w:w="2000" w:type="dxa"/>
-            <w:shd w:val="clear" w:color="auto" w:fill="BDD7EE"/>
             <w:vAlign w:val="center"/>
           </w:tcPr>
           <w:p>
@@ -2782,7 +2673,6 @@
         <w:tc>
           <w:tcPr>
             <w:tcW w:w="1840" w:type="dxa"/>
-            <w:shd w:val="clear" w:color="auto" w:fill="F2F2F2"/>
             <w:vAlign w:val="center"/>
           </w:tcPr>
           <w:p>
@@ -2804,7 +2694,6 @@
         <w:tc>
           <w:tcPr>
             <w:tcW w:w="1840" w:type="dxa"/>
-            <w:shd w:val="clear" w:color="auto" w:fill="F2F2F2"/>
             <w:vAlign w:val="center"/>
           </w:tcPr>
           <w:p>
@@ -2826,7 +2715,6 @@
         <w:tc>
           <w:tcPr>
             <w:tcW w:w="1840" w:type="dxa"/>
-            <w:shd w:val="clear" w:color="auto" w:fill="F2F2F2"/>
             <w:vAlign w:val="center"/>
           </w:tcPr>
           <w:p>
@@ -2848,7 +2736,6 @@
         <w:tc>
           <w:tcPr>
             <w:tcW w:w="1840" w:type="dxa"/>
-            <w:shd w:val="clear" w:color="auto" w:fill="F2F2F2"/>
             <w:vAlign w:val="center"/>
           </w:tcPr>
           <w:p>
@@ -2875,7 +2762,6 @@
         <w:tc>
           <w:tcPr>
             <w:tcW w:w="2000" w:type="dxa"/>
-            <w:shd w:val="clear" w:color="auto" w:fill="BDD7EE"/>
             <w:vAlign w:val="center"/>
           </w:tcPr>
           <w:p>
@@ -2899,7 +2785,6 @@
         <w:tc>
           <w:tcPr>
             <w:tcW w:w="1840" w:type="dxa"/>
-            <w:shd w:val="clear" w:color="auto" w:fill="DEEAF6"/>
             <w:vAlign w:val="center"/>
           </w:tcPr>
           <w:p>
@@ -2921,7 +2806,6 @@
         <w:tc>
           <w:tcPr>
             <w:tcW w:w="1840" w:type="dxa"/>
-            <w:shd w:val="clear" w:color="auto" w:fill="DEEAF6"/>
             <w:vAlign w:val="center"/>
           </w:tcPr>
           <w:p>
@@ -2943,7 +2827,6 @@
         <w:tc>
           <w:tcPr>
             <w:tcW w:w="1840" w:type="dxa"/>
-            <w:shd w:val="clear" w:color="auto" w:fill="DEEAF6"/>
             <w:vAlign w:val="center"/>
           </w:tcPr>
           <w:p>
@@ -2965,7 +2848,6 @@
         <w:tc>
           <w:tcPr>
             <w:tcW w:w="1840" w:type="dxa"/>
-            <w:shd w:val="clear" w:color="auto" w:fill="DEEAF6"/>
             <w:vAlign w:val="center"/>
           </w:tcPr>
           <w:p>
@@ -2992,7 +2874,6 @@
         <w:tc>
           <w:tcPr>
             <w:tcW w:w="2000" w:type="dxa"/>
-            <w:shd w:val="clear" w:color="auto" w:fill="BDD7EE"/>
             <w:vAlign w:val="center"/>
           </w:tcPr>
           <w:p>
@@ -3016,7 +2897,6 @@
         <w:tc>
           <w:tcPr>
             <w:tcW w:w="1840" w:type="dxa"/>
-            <w:shd w:val="clear" w:color="auto" w:fill="F2F2F2"/>
             <w:vAlign w:val="center"/>
           </w:tcPr>
           <w:p>
@@ -3038,7 +2918,6 @@
         <w:tc>
           <w:tcPr>
             <w:tcW w:w="1840" w:type="dxa"/>
-            <w:shd w:val="clear" w:color="auto" w:fill="F2F2F2"/>
             <w:vAlign w:val="center"/>
           </w:tcPr>
           <w:p>
@@ -3060,7 +2939,6 @@
         <w:tc>
           <w:tcPr>
             <w:tcW w:w="1840" w:type="dxa"/>
-            <w:shd w:val="clear" w:color="auto" w:fill="F2F2F2"/>
             <w:vAlign w:val="center"/>
           </w:tcPr>
           <w:p>
@@ -3082,7 +2960,6 @@
         <w:tc>
           <w:tcPr>
             <w:tcW w:w="1840" w:type="dxa"/>
-            <w:shd w:val="clear" w:color="auto" w:fill="F2F2F2"/>
             <w:vAlign w:val="center"/>
           </w:tcPr>
           <w:p>

</xml_diff>